<commit_message>
Aplicar feedback del profe: justificar + Resumen autocontenido
</commit_message>
<xml_diff>
--- a/reporte/informe_tecnico_proyecto_DIIAA.docx
+++ b/reporte/informe_tecnico_proyecto_DIIAA.docx
@@ -4,7 +4,7 @@
   <w:body>
     <w:p>
       <w:pPr>
-        <w:jc w:val="center"/>
+        <w:jc w:val="both"/>
         <w:rPr/>
       </w:pPr>
       <w:r>
@@ -27,7 +27,7 @@
     </w:p>
     <w:p>
       <w:pPr>
-        <w:jc w:val="center"/>
+        <w:jc w:val="both"/>
         <w:rPr/>
       </w:pPr>
       <w:r>
@@ -68,7 +68,7 @@
     </w:p>
     <w:p>
       <w:pPr>
-        <w:jc w:val="center"/>
+        <w:jc w:val="both"/>
         <w:rPr/>
       </w:pPr>
       <w:r>
@@ -135,7 +135,7 @@
     </w:p>
     <w:p>
       <w:pPr>
-        <w:jc w:val="center"/>
+        <w:jc w:val="both"/>
         <w:rPr/>
       </w:pPr>
       <w:r>
@@ -231,6 +231,7 @@
     </w:p>
     <w:p>
       <w:pPr>
+        <w:jc w:val="both"/>
         <w:rPr/>
       </w:pPr>
       <w:r>
@@ -251,6 +252,7 @@
     </w:p>
     <w:p>
       <w:pPr>
+        <w:jc w:val="both"/>
         <w:rPr/>
       </w:pPr>
       <w:r>
@@ -271,6 +273,7 @@
     </w:p>
     <w:p>
       <w:pPr>
+        <w:jc w:val="both"/>
         <w:rPr/>
       </w:pPr>
       <w:r>
@@ -309,7 +312,7 @@
         <w:shd w:fill="auto" w:val="clear"/>
         <w:spacing w:after="0" w:before="0" w:line="276" w:lineRule="auto"/>
         <w:ind w:left="360" w:right="0" w:hanging="360"/>
-        <w:jc w:val="left"/>
+        <w:jc w:val="both"/>
         <w:rPr/>
       </w:pPr>
       <w:r>
@@ -352,7 +355,7 @@
         <w:shd w:fill="auto" w:val="clear"/>
         <w:spacing w:after="0" w:before="0" w:line="276" w:lineRule="auto"/>
         <w:ind w:left="360" w:right="0" w:hanging="360"/>
-        <w:jc w:val="left"/>
+        <w:jc w:val="both"/>
         <w:rPr/>
       </w:pPr>
       <w:r>
@@ -395,7 +398,7 @@
         <w:shd w:fill="auto" w:val="clear"/>
         <w:spacing w:after="0" w:before="0" w:line="276" w:lineRule="auto"/>
         <w:ind w:left="360" w:right="0" w:hanging="360"/>
-        <w:jc w:val="left"/>
+        <w:jc w:val="both"/>
         <w:rPr/>
       </w:pPr>
       <w:r>
@@ -438,7 +441,7 @@
         <w:shd w:fill="auto" w:val="clear"/>
         <w:spacing w:after="0" w:before="0" w:line="276" w:lineRule="auto"/>
         <w:ind w:left="360" w:right="0" w:hanging="360"/>
-        <w:jc w:val="left"/>
+        <w:jc w:val="both"/>
         <w:rPr/>
       </w:pPr>
       <w:r>
@@ -481,7 +484,7 @@
         <w:shd w:fill="auto" w:val="clear"/>
         <w:spacing w:after="200" w:before="0" w:line="276" w:lineRule="auto"/>
         <w:ind w:left="360" w:right="0" w:hanging="360"/>
-        <w:jc w:val="left"/>
+        <w:jc w:val="both"/>
         <w:rPr/>
       </w:pPr>
       <w:r>
@@ -506,6 +509,69 @@
     </w:p>
     <w:p>
       <w:pPr>
+        <w:jc w:val="both"/>
+        <w:rPr/>
+      </w:pPr>
+      <w:r>
+        <w:rPr>
+          <w:b w:val="0"/>
+          <w:i w:val="0"/>
+        </w:rPr>
+        <w:t>El trabajo demuestra que un sistema RAG construido sobre componentes open source (sentence-transformers, Chroma, rank-bm25) más un LLM gestionado puede entregar respuestas trazables y multilingües con cero hallucination sobre la muestra evaluada, a un costo por consulta despreciable. Las dos limitaciones más relevantes son el tamaño reducido del corpus sintético (35 FAQs generadas con LLM) y de la muestra para Faithfulness (n = 5 mails), que acotan la validez externa de las cifras y requieren ampliarse antes de un despliegue productivo.</w:t>
+      </w:r>
+    </w:p>
+    <w:p>
+      <w:pPr>
+        <w:rPr/>
+      </w:pPr>
+      <w:r>
+        <w:br w:type="page"/>
+      </w:r>
+      <w:r>
+        <w:rPr>
+          <w:rtl w:val="0"/>
+        </w:rPr>
+      </w:r>
+    </w:p>
+    <w:p>
+      <w:pPr>
+        <w:pStyle w:val="Heading1"/>
+        <w:rPr/>
+      </w:pPr>
+      <w:r>
+        <w:rPr>
+          <w:color w:val="1f3a5f"/>
+          <w:rtl w:val="0"/>
+        </w:rPr>
+        <w:t xml:space="preserve">2. Justificación de la Solución</w:t>
+      </w:r>
+      <w:r>
+        <w:rPr>
+          <w:rtl w:val="0"/>
+        </w:rPr>
+      </w:r>
+    </w:p>
+    <w:p>
+      <w:pPr>
+        <w:pStyle w:val="Heading2"/>
+        <w:rPr/>
+      </w:pPr>
+      <w:r>
+        <w:rPr>
+          <w:color w:val="2e5c8a"/>
+          <w:rtl w:val="0"/>
+        </w:rPr>
+        <w:t xml:space="preserve">2.1 Contexto y problema</w:t>
+      </w:r>
+      <w:r>
+        <w:rPr>
+          <w:rtl w:val="0"/>
+        </w:rPr>
+      </w:r>
+    </w:p>
+    <w:p>
+      <w:pPr>
+        <w:jc w:val="both"/>
         <w:rPr/>
       </w:pPr>
       <w:r>
@@ -516,65 +582,17 @@
           <w:iCs w:val="0"/>
           <w:rtl w:val="0"/>
         </w:rPr>
-        <w:t xml:space="preserve">El trabajo demuestra que un sistema RAG construido sobre componentes open source (sentence-transformers, Chroma, rank-bm25) más un LLM gestionado puede entregar respuestas trazables y multilingües con cero hallucination sobre la muestra evaluada, a un costo por consulta despreciable. La principal limitación es el tamaño reducido del corpus sintético (35 FAQs) y de la muestra para Faithfulness (n = 5), que se discuten en la Sección 6.</w:t>
-      </w:r>
-      <w:r>
-        <w:rPr>
-          <w:rtl w:val="0"/>
-        </w:rPr>
-      </w:r>
-    </w:p>
-    <w:p>
-      <w:pPr>
-        <w:rPr/>
-      </w:pPr>
-      <w:r>
-        <w:br w:type="page"/>
-      </w:r>
-      <w:r>
-        <w:rPr>
-          <w:rtl w:val="0"/>
-        </w:rPr>
-      </w:r>
-    </w:p>
-    <w:p>
-      <w:pPr>
-        <w:pStyle w:val="Heading1"/>
-        <w:rPr/>
-      </w:pPr>
-      <w:r>
-        <w:rPr>
-          <w:color w:val="1f3a5f"/>
-          <w:rtl w:val="0"/>
-        </w:rPr>
-        <w:t xml:space="preserve">2. Justificación de la Solución</w:t>
-      </w:r>
-      <w:r>
-        <w:rPr>
-          <w:rtl w:val="0"/>
-        </w:rPr>
-      </w:r>
-    </w:p>
-    <w:p>
-      <w:pPr>
-        <w:pStyle w:val="Heading2"/>
-        <w:rPr/>
-      </w:pPr>
-      <w:r>
-        <w:rPr>
-          <w:color w:val="2e5c8a"/>
-          <w:rtl w:val="0"/>
-        </w:rPr>
-        <w:t xml:space="preserve">2.1 Contexto y problema</w:t>
-      </w:r>
-      <w:r>
-        <w:rPr>
-          <w:rtl w:val="0"/>
-        </w:rPr>
-      </w:r>
-    </w:p>
-    <w:p>
-      <w:pPr>
+        <w:t xml:space="preserve">Las áreas de atención al cliente de empresas de e-commerce reciben diariamente cientos a miles de mails de naturaleza heterogénea: consultas sobre pedidos, reclamos por cobros, pedidos de cancelación, consultas generales. El procesamiento manual implica tres tareas concatenadas por cada mensaje: (1) lectura, (2) clasificación al área correspondiente, (3) redacción de la respuesta. Esta carga genera demoras en los tiempos de respuesta (SLA), errores de derivación entre equipos e inconsistencias de tono y contenido entre distintos agentes.</w:t>
+      </w:r>
+      <w:r>
+        <w:rPr>
+          <w:rtl w:val="0"/>
+        </w:rPr>
+      </w:r>
+    </w:p>
+    <w:p>
+      <w:pPr>
+        <w:jc w:val="both"/>
         <w:rPr/>
       </w:pPr>
       <w:r>
@@ -585,16 +603,35 @@
           <w:iCs w:val="0"/>
           <w:rtl w:val="0"/>
         </w:rPr>
-        <w:t xml:space="preserve">Las áreas de atención al cliente de empresas de e-commerce reciben diariamente cientos a miles de mails de naturaleza heterogénea: consultas sobre pedidos, reclamos por cobros, pedidos de cancelación, consultas generales. El procesamiento manual implica tres tareas concatenadas por cada mensaje: (1) lectura, (2) clasificación al área correspondiente, (3) redacción de la respuesta. Esta carga genera demoras en los tiempos de respuesta (SLA), errores de derivación entre equipos e inconsistencias de tono y contenido entre distintos agentes.</w:t>
-      </w:r>
-      <w:r>
-        <w:rPr>
-          <w:rtl w:val="0"/>
-        </w:rPr>
-      </w:r>
-    </w:p>
-    <w:p>
-      <w:pPr>
+        <w:t xml:space="preserve">Una solución de NLP que automatice las tareas (1) y (2) y produzca un borrador para (3) representa un ahorro operativo medible y una mejora directa en la experiencia del cliente. El presente trabajo aborda este problema.</w:t>
+      </w:r>
+      <w:r>
+        <w:rPr>
+          <w:rtl w:val="0"/>
+        </w:rPr>
+      </w:r>
+    </w:p>
+    <w:p>
+      <w:pPr>
+        <w:pStyle w:val="Heading2"/>
+        <w:rPr/>
+      </w:pPr>
+      <w:r>
+        <w:rPr>
+          <w:color w:val="2e5c8a"/>
+          <w:rtl w:val="0"/>
+        </w:rPr>
+        <w:t xml:space="preserve">2.2 Decisiones de diseño y trade-offs</w:t>
+      </w:r>
+      <w:r>
+        <w:rPr>
+          <w:rtl w:val="0"/>
+        </w:rPr>
+      </w:r>
+    </w:p>
+    <w:p>
+      <w:pPr>
+        <w:jc w:val="both"/>
         <w:rPr/>
       </w:pPr>
       <w:r>
@@ -605,44 +642,6 @@
           <w:iCs w:val="0"/>
           <w:rtl w:val="0"/>
         </w:rPr>
-        <w:t xml:space="preserve">Una solución de NLP que automatice las tareas (1) y (2) y produzca un borrador para (3) representa un ahorro operativo medible y una mejora directa en la experiencia del cliente. El presente trabajo aborda este problema.</w:t>
-      </w:r>
-      <w:r>
-        <w:rPr>
-          <w:rtl w:val="0"/>
-        </w:rPr>
-      </w:r>
-    </w:p>
-    <w:p>
-      <w:pPr>
-        <w:pStyle w:val="Heading2"/>
-        <w:rPr/>
-      </w:pPr>
-      <w:r>
-        <w:rPr>
-          <w:color w:val="2e5c8a"/>
-          <w:rtl w:val="0"/>
-        </w:rPr>
-        <w:t xml:space="preserve">2.2 Decisiones de diseño y trade-offs</w:t>
-      </w:r>
-      <w:r>
-        <w:rPr>
-          <w:rtl w:val="0"/>
-        </w:rPr>
-      </w:r>
-    </w:p>
-    <w:p>
-      <w:pPr>
-        <w:rPr/>
-      </w:pPr>
-      <w:r>
-        <w:rPr>
-          <w:b w:val="0"/>
-          <w:bCs w:val="0"/>
-          <w:i w:val="0"/>
-          <w:iCs w:val="0"/>
-          <w:rtl w:val="0"/>
-        </w:rPr>
         <w:t xml:space="preserve">A continuación se documentan las decisiones técnicas principales siguiendo el formato Decisión / Alternativas evaluadas / Criterio de elección / Costo asumido.</w:t>
       </w:r>
       <w:r>
@@ -653,6 +652,7 @@
     </w:p>
     <w:p>
       <w:pPr>
+        <w:jc w:val="both"/>
         <w:rPr/>
       </w:pPr>
       <w:r>
@@ -707,6 +707,7 @@
           <w:tcPr/>
           <w:p>
             <w:pPr>
+              <w:jc w:val="both"/>
               <w:rPr/>
             </w:pPr>
             <w:r>
@@ -728,6 +729,7 @@
           <w:tcPr/>
           <w:p>
             <w:pPr>
+              <w:jc w:val="both"/>
               <w:rPr/>
             </w:pPr>
             <w:r>
@@ -755,6 +757,7 @@
           <w:tcPr/>
           <w:p>
             <w:pPr>
+              <w:jc w:val="both"/>
               <w:rPr/>
             </w:pPr>
             <w:r>
@@ -769,6 +772,7 @@
           <w:tcPr/>
           <w:p>
             <w:pPr>
+              <w:jc w:val="both"/>
               <w:rPr/>
             </w:pPr>
             <w:r>
@@ -789,6 +793,7 @@
           <w:tcPr/>
           <w:p>
             <w:pPr>
+              <w:jc w:val="both"/>
               <w:rPr/>
             </w:pPr>
             <w:r>
@@ -803,6 +808,7 @@
           <w:tcPr/>
           <w:p>
             <w:pPr>
+              <w:jc w:val="both"/>
               <w:rPr/>
             </w:pPr>
             <w:r>
@@ -823,6 +829,7 @@
           <w:tcPr/>
           <w:p>
             <w:pPr>
+              <w:jc w:val="both"/>
               <w:rPr/>
             </w:pPr>
             <w:r>
@@ -837,6 +844,7 @@
           <w:tcPr/>
           <w:p>
             <w:pPr>
+              <w:jc w:val="both"/>
               <w:rPr/>
             </w:pPr>
             <w:r>
@@ -857,6 +865,7 @@
           <w:tcPr/>
           <w:p>
             <w:pPr>
+              <w:jc w:val="both"/>
               <w:rPr/>
             </w:pPr>
             <w:r>
@@ -871,6 +880,7 @@
           <w:tcPr/>
           <w:p>
             <w:pPr>
+              <w:jc w:val="both"/>
               <w:rPr/>
             </w:pPr>
             <w:r>
@@ -895,6 +905,7 @@
     </w:p>
     <w:p>
       <w:pPr>
+        <w:jc w:val="both"/>
         <w:rPr/>
       </w:pPr>
       <w:r>
@@ -949,6 +960,7 @@
           <w:tcPr/>
           <w:p>
             <w:pPr>
+              <w:jc w:val="both"/>
               <w:rPr/>
             </w:pPr>
             <w:r>
@@ -970,6 +982,7 @@
           <w:tcPr/>
           <w:p>
             <w:pPr>
+              <w:jc w:val="both"/>
               <w:rPr/>
             </w:pPr>
             <w:r>
@@ -997,6 +1010,7 @@
           <w:tcPr/>
           <w:p>
             <w:pPr>
+              <w:jc w:val="both"/>
               <w:rPr/>
             </w:pPr>
             <w:r>
@@ -1011,6 +1025,7 @@
           <w:tcPr/>
           <w:p>
             <w:pPr>
+              <w:jc w:val="both"/>
               <w:rPr/>
             </w:pPr>
             <w:r>
@@ -1031,6 +1046,7 @@
           <w:tcPr/>
           <w:p>
             <w:pPr>
+              <w:jc w:val="both"/>
               <w:rPr/>
             </w:pPr>
             <w:r>
@@ -1045,6 +1061,7 @@
           <w:tcPr/>
           <w:p>
             <w:pPr>
+              <w:jc w:val="both"/>
               <w:rPr/>
             </w:pPr>
             <w:r>
@@ -1065,6 +1082,7 @@
           <w:tcPr/>
           <w:p>
             <w:pPr>
+              <w:jc w:val="both"/>
               <w:rPr/>
             </w:pPr>
             <w:r>
@@ -1079,6 +1097,7 @@
           <w:tcPr/>
           <w:p>
             <w:pPr>
+              <w:jc w:val="both"/>
               <w:rPr/>
             </w:pPr>
             <w:r>
@@ -1099,6 +1118,7 @@
           <w:tcPr/>
           <w:p>
             <w:pPr>
+              <w:jc w:val="both"/>
               <w:rPr/>
             </w:pPr>
             <w:r>
@@ -1113,6 +1133,7 @@
           <w:tcPr/>
           <w:p>
             <w:pPr>
+              <w:jc w:val="both"/>
               <w:rPr/>
             </w:pPr>
             <w:r>
@@ -1137,6 +1158,7 @@
     </w:p>
     <w:p>
       <w:pPr>
+        <w:jc w:val="both"/>
         <w:rPr/>
       </w:pPr>
       <w:r>
@@ -1157,6 +1179,7 @@
     </w:p>
     <w:p>
       <w:pPr>
+        <w:jc w:val="both"/>
         <w:rPr/>
       </w:pPr>
       <w:r>
@@ -1211,6 +1234,7 @@
           <w:tcPr/>
           <w:p>
             <w:pPr>
+              <w:jc w:val="both"/>
               <w:rPr/>
             </w:pPr>
             <w:r>
@@ -1232,6 +1256,7 @@
           <w:tcPr/>
           <w:p>
             <w:pPr>
+              <w:jc w:val="both"/>
               <w:rPr/>
             </w:pPr>
             <w:r>
@@ -1259,6 +1284,7 @@
           <w:tcPr/>
           <w:p>
             <w:pPr>
+              <w:jc w:val="both"/>
               <w:rPr/>
             </w:pPr>
             <w:r>
@@ -1273,6 +1299,7 @@
           <w:tcPr/>
           <w:p>
             <w:pPr>
+              <w:jc w:val="both"/>
               <w:rPr/>
             </w:pPr>
             <w:r>
@@ -1293,6 +1320,7 @@
           <w:tcPr/>
           <w:p>
             <w:pPr>
+              <w:jc w:val="both"/>
               <w:rPr/>
             </w:pPr>
             <w:r>
@@ -1307,6 +1335,7 @@
           <w:tcPr/>
           <w:p>
             <w:pPr>
+              <w:jc w:val="both"/>
               <w:rPr/>
             </w:pPr>
             <w:r>
@@ -1327,6 +1356,7 @@
           <w:tcPr/>
           <w:p>
             <w:pPr>
+              <w:jc w:val="both"/>
               <w:rPr/>
             </w:pPr>
             <w:r>
@@ -1341,6 +1371,7 @@
           <w:tcPr/>
           <w:p>
             <w:pPr>
+              <w:jc w:val="both"/>
               <w:rPr/>
             </w:pPr>
             <w:r>
@@ -1361,6 +1392,7 @@
           <w:tcPr/>
           <w:p>
             <w:pPr>
+              <w:jc w:val="both"/>
               <w:rPr/>
             </w:pPr>
             <w:r>
@@ -1375,6 +1407,7 @@
           <w:tcPr/>
           <w:p>
             <w:pPr>
+              <w:jc w:val="both"/>
               <w:rPr/>
             </w:pPr>
             <w:r>
@@ -1399,6 +1432,7 @@
     </w:p>
     <w:p>
       <w:pPr>
+        <w:jc w:val="both"/>
         <w:rPr/>
       </w:pPr>
       <w:r>
@@ -1453,6 +1487,7 @@
           <w:tcPr/>
           <w:p>
             <w:pPr>
+              <w:jc w:val="both"/>
               <w:rPr/>
             </w:pPr>
             <w:r>
@@ -1474,6 +1509,7 @@
           <w:tcPr/>
           <w:p>
             <w:pPr>
+              <w:jc w:val="both"/>
               <w:rPr/>
             </w:pPr>
             <w:r>
@@ -1501,6 +1537,7 @@
           <w:tcPr/>
           <w:p>
             <w:pPr>
+              <w:jc w:val="both"/>
               <w:rPr/>
             </w:pPr>
             <w:r>
@@ -1515,6 +1552,7 @@
           <w:tcPr/>
           <w:p>
             <w:pPr>
+              <w:jc w:val="both"/>
               <w:rPr/>
             </w:pPr>
             <w:r>
@@ -1535,6 +1573,7 @@
           <w:tcPr/>
           <w:p>
             <w:pPr>
+              <w:jc w:val="both"/>
               <w:rPr/>
             </w:pPr>
             <w:r>
@@ -1549,6 +1588,7 @@
           <w:tcPr/>
           <w:p>
             <w:pPr>
+              <w:jc w:val="both"/>
               <w:rPr/>
             </w:pPr>
             <w:r>
@@ -1569,6 +1609,7 @@
           <w:tcPr/>
           <w:p>
             <w:pPr>
+              <w:jc w:val="both"/>
               <w:rPr/>
             </w:pPr>
             <w:r>
@@ -1583,6 +1624,7 @@
           <w:tcPr/>
           <w:p>
             <w:pPr>
+              <w:jc w:val="both"/>
               <w:rPr/>
             </w:pPr>
             <w:r>
@@ -1603,6 +1645,7 @@
           <w:tcPr/>
           <w:p>
             <w:pPr>
+              <w:jc w:val="both"/>
               <w:rPr/>
             </w:pPr>
             <w:r>
@@ -1617,6 +1660,7 @@
           <w:tcPr/>
           <w:p>
             <w:pPr>
+              <w:jc w:val="both"/>
               <w:rPr/>
             </w:pPr>
             <w:r>
@@ -1641,6 +1685,7 @@
     </w:p>
     <w:p>
       <w:pPr>
+        <w:jc w:val="both"/>
         <w:rPr/>
       </w:pPr>
       <w:r>
@@ -1695,6 +1740,7 @@
           <w:tcPr/>
           <w:p>
             <w:pPr>
+              <w:jc w:val="both"/>
               <w:rPr/>
             </w:pPr>
             <w:r>
@@ -1716,6 +1762,7 @@
           <w:tcPr/>
           <w:p>
             <w:pPr>
+              <w:jc w:val="both"/>
               <w:rPr/>
             </w:pPr>
             <w:r>
@@ -1743,6 +1790,7 @@
           <w:tcPr/>
           <w:p>
             <w:pPr>
+              <w:jc w:val="both"/>
               <w:rPr/>
             </w:pPr>
             <w:r>
@@ -1757,6 +1805,7 @@
           <w:tcPr/>
           <w:p>
             <w:pPr>
+              <w:jc w:val="both"/>
               <w:rPr/>
             </w:pPr>
             <w:r>
@@ -1777,6 +1826,7 @@
           <w:tcPr/>
           <w:p>
             <w:pPr>
+              <w:jc w:val="both"/>
               <w:rPr/>
             </w:pPr>
             <w:r>
@@ -1791,6 +1841,7 @@
           <w:tcPr/>
           <w:p>
             <w:pPr>
+              <w:jc w:val="both"/>
               <w:rPr/>
             </w:pPr>
             <w:r>
@@ -1811,6 +1862,7 @@
           <w:tcPr/>
           <w:p>
             <w:pPr>
+              <w:jc w:val="both"/>
               <w:rPr/>
             </w:pPr>
             <w:r>
@@ -1825,6 +1877,7 @@
           <w:tcPr/>
           <w:p>
             <w:pPr>
+              <w:jc w:val="both"/>
               <w:rPr/>
             </w:pPr>
             <w:r>
@@ -1845,6 +1898,7 @@
           <w:tcPr/>
           <w:p>
             <w:pPr>
+              <w:jc w:val="both"/>
               <w:rPr/>
             </w:pPr>
             <w:r>
@@ -1859,6 +1913,7 @@
           <w:tcPr/>
           <w:p>
             <w:pPr>
+              <w:jc w:val="both"/>
               <w:rPr/>
             </w:pPr>
             <w:r>
@@ -1883,6 +1938,7 @@
     </w:p>
     <w:p>
       <w:pPr>
+        <w:jc w:val="both"/>
         <w:rPr/>
       </w:pPr>
       <w:r>
@@ -1903,6 +1959,7 @@
     </w:p>
     <w:p>
       <w:pPr>
+        <w:jc w:val="both"/>
         <w:rPr/>
       </w:pPr>
       <w:r>
@@ -1957,6 +2014,7 @@
           <w:tcPr/>
           <w:p>
             <w:pPr>
+              <w:jc w:val="both"/>
               <w:rPr/>
             </w:pPr>
             <w:r>
@@ -1978,6 +2036,7 @@
           <w:tcPr/>
           <w:p>
             <w:pPr>
+              <w:jc w:val="both"/>
               <w:rPr/>
             </w:pPr>
             <w:r>
@@ -2005,6 +2064,7 @@
           <w:tcPr/>
           <w:p>
             <w:pPr>
+              <w:jc w:val="both"/>
               <w:rPr/>
             </w:pPr>
             <w:r>
@@ -2019,6 +2079,7 @@
           <w:tcPr/>
           <w:p>
             <w:pPr>
+              <w:jc w:val="both"/>
               <w:rPr/>
             </w:pPr>
             <w:r>
@@ -2039,6 +2100,7 @@
           <w:tcPr/>
           <w:p>
             <w:pPr>
+              <w:jc w:val="both"/>
               <w:rPr/>
             </w:pPr>
             <w:r>
@@ -2053,6 +2115,7 @@
           <w:tcPr/>
           <w:p>
             <w:pPr>
+              <w:jc w:val="both"/>
               <w:rPr/>
             </w:pPr>
             <w:r>
@@ -2073,6 +2136,7 @@
           <w:tcPr/>
           <w:p>
             <w:pPr>
+              <w:jc w:val="both"/>
               <w:rPr/>
             </w:pPr>
             <w:r>
@@ -2087,6 +2151,7 @@
           <w:tcPr/>
           <w:p>
             <w:pPr>
+              <w:jc w:val="both"/>
               <w:rPr/>
             </w:pPr>
             <w:r>
@@ -2107,6 +2172,7 @@
           <w:tcPr/>
           <w:p>
             <w:pPr>
+              <w:jc w:val="both"/>
               <w:rPr/>
             </w:pPr>
             <w:r>
@@ -2121,6 +2187,7 @@
           <w:tcPr/>
           <w:p>
             <w:pPr>
+              <w:jc w:val="both"/>
               <w:rPr/>
             </w:pPr>
             <w:r>
@@ -2145,6 +2212,7 @@
     </w:p>
     <w:p>
       <w:pPr>
+        <w:jc w:val="both"/>
         <w:rPr/>
       </w:pPr>
       <w:r>
@@ -2199,6 +2267,7 @@
           <w:tcPr/>
           <w:p>
             <w:pPr>
+              <w:jc w:val="both"/>
               <w:rPr/>
             </w:pPr>
             <w:r>
@@ -2220,6 +2289,7 @@
           <w:tcPr/>
           <w:p>
             <w:pPr>
+              <w:jc w:val="both"/>
               <w:rPr/>
             </w:pPr>
             <w:r>
@@ -2247,6 +2317,7 @@
           <w:tcPr/>
           <w:p>
             <w:pPr>
+              <w:jc w:val="both"/>
               <w:rPr/>
             </w:pPr>
             <w:r>
@@ -2261,6 +2332,7 @@
           <w:tcPr/>
           <w:p>
             <w:pPr>
+              <w:jc w:val="both"/>
               <w:rPr/>
             </w:pPr>
             <w:r>
@@ -2281,6 +2353,7 @@
           <w:tcPr/>
           <w:p>
             <w:pPr>
+              <w:jc w:val="both"/>
               <w:rPr/>
             </w:pPr>
             <w:r>
@@ -2295,6 +2368,7 @@
           <w:tcPr/>
           <w:p>
             <w:pPr>
+              <w:jc w:val="both"/>
               <w:rPr/>
             </w:pPr>
             <w:r>
@@ -2315,6 +2389,7 @@
           <w:tcPr/>
           <w:p>
             <w:pPr>
+              <w:jc w:val="both"/>
               <w:rPr/>
             </w:pPr>
             <w:r>
@@ -2329,6 +2404,7 @@
           <w:tcPr/>
           <w:p>
             <w:pPr>
+              <w:jc w:val="both"/>
               <w:rPr/>
             </w:pPr>
             <w:r>
@@ -2349,6 +2425,7 @@
           <w:tcPr/>
           <w:p>
             <w:pPr>
+              <w:jc w:val="both"/>
               <w:rPr/>
             </w:pPr>
             <w:r>
@@ -2363,6 +2440,7 @@
           <w:tcPr/>
           <w:p>
             <w:pPr>
+              <w:jc w:val="both"/>
               <w:rPr/>
             </w:pPr>
             <w:r>
@@ -2436,6 +2514,7 @@
     </w:p>
     <w:p>
       <w:pPr>
+        <w:jc w:val="both"/>
         <w:rPr/>
       </w:pPr>
       <w:r>
@@ -2494,6 +2573,7 @@
           <w:tcPr/>
           <w:p>
             <w:pPr>
+              <w:jc w:val="both"/>
               <w:rPr/>
             </w:pPr>
             <w:r>
@@ -2515,6 +2595,7 @@
           <w:tcPr/>
           <w:p>
             <w:pPr>
+              <w:jc w:val="both"/>
               <w:rPr/>
             </w:pPr>
             <w:r>
@@ -2536,6 +2617,7 @@
           <w:tcPr/>
           <w:p>
             <w:pPr>
+              <w:jc w:val="both"/>
               <w:rPr/>
             </w:pPr>
             <w:r>
@@ -2557,6 +2639,7 @@
           <w:tcPr/>
           <w:p>
             <w:pPr>
+              <w:jc w:val="both"/>
               <w:rPr/>
             </w:pPr>
             <w:r>
@@ -2584,6 +2667,7 @@
           <w:tcPr/>
           <w:p>
             <w:pPr>
+              <w:jc w:val="both"/>
               <w:rPr/>
             </w:pPr>
             <w:r>
@@ -2598,6 +2682,7 @@
           <w:tcPr/>
           <w:p>
             <w:pPr>
+              <w:jc w:val="both"/>
               <w:rPr/>
             </w:pPr>
             <w:r>
@@ -2612,6 +2697,7 @@
           <w:tcPr/>
           <w:p>
             <w:pPr>
+              <w:jc w:val="both"/>
               <w:rPr/>
             </w:pPr>
             <w:r>
@@ -2626,6 +2712,7 @@
           <w:tcPr/>
           <w:p>
             <w:pPr>
+              <w:jc w:val="both"/>
               <w:rPr/>
             </w:pPr>
             <w:r>
@@ -2646,6 +2733,7 @@
           <w:tcPr/>
           <w:p>
             <w:pPr>
+              <w:jc w:val="both"/>
               <w:rPr/>
             </w:pPr>
             <w:r>
@@ -2660,6 +2748,7 @@
           <w:tcPr/>
           <w:p>
             <w:pPr>
+              <w:jc w:val="both"/>
               <w:rPr/>
             </w:pPr>
             <w:r>
@@ -2674,6 +2763,7 @@
           <w:tcPr/>
           <w:p>
             <w:pPr>
+              <w:jc w:val="both"/>
               <w:rPr/>
             </w:pPr>
             <w:r>
@@ -2688,6 +2778,7 @@
           <w:tcPr/>
           <w:p>
             <w:pPr>
+              <w:jc w:val="both"/>
               <w:rPr/>
             </w:pPr>
             <w:r>
@@ -2708,6 +2799,7 @@
           <w:tcPr/>
           <w:p>
             <w:pPr>
+              <w:jc w:val="both"/>
               <w:rPr/>
             </w:pPr>
             <w:r>
@@ -2722,6 +2814,7 @@
           <w:tcPr/>
           <w:p>
             <w:pPr>
+              <w:jc w:val="both"/>
               <w:rPr/>
             </w:pPr>
             <w:r>
@@ -2736,6 +2829,7 @@
           <w:tcPr/>
           <w:p>
             <w:pPr>
+              <w:jc w:val="both"/>
               <w:rPr/>
             </w:pPr>
             <w:r>
@@ -2750,6 +2844,7 @@
           <w:tcPr/>
           <w:p>
             <w:pPr>
+              <w:jc w:val="both"/>
               <w:rPr/>
             </w:pPr>
             <w:r>
@@ -2792,6 +2887,7 @@
     </w:p>
     <w:p>
       <w:pPr>
+        <w:jc w:val="both"/>
         <w:rPr/>
       </w:pPr>
       <w:r>
@@ -2833,6 +2929,7 @@
     </w:p>
     <w:p>
       <w:pPr>
+        <w:jc w:val="both"/>
         <w:rPr/>
       </w:pPr>
       <w:r>
@@ -2853,6 +2950,7 @@
     </w:p>
     <w:p>
       <w:pPr>
+        <w:jc w:val="both"/>
         <w:rPr/>
       </w:pPr>
       <w:r>
@@ -2873,6 +2971,7 @@
     </w:p>
     <w:p>
       <w:pPr>
+        <w:jc w:val="both"/>
         <w:rPr/>
       </w:pPr>
       <w:r>
@@ -2893,6 +2992,7 @@
     </w:p>
     <w:p>
       <w:pPr>
+        <w:jc w:val="both"/>
         <w:rPr/>
       </w:pPr>
       <w:r>
@@ -2913,6 +3013,7 @@
     </w:p>
     <w:p>
       <w:pPr>
+        <w:jc w:val="both"/>
         <w:rPr/>
       </w:pPr>
       <w:r>
@@ -2933,6 +3034,7 @@
     </w:p>
     <w:p>
       <w:pPr>
+        <w:jc w:val="both"/>
         <w:rPr/>
       </w:pPr>
       <w:r>
@@ -2969,6 +3071,7 @@
     </w:p>
     <w:p>
       <w:pPr>
+        <w:jc w:val="both"/>
         <w:rPr/>
       </w:pPr>
       <w:r>
@@ -2989,6 +3092,7 @@
     </w:p>
     <w:p>
       <w:pPr>
+        <w:jc w:val="both"/>
         <w:rPr/>
       </w:pPr>
       <w:r>
@@ -3025,6 +3129,7 @@
     </w:p>
     <w:p>
       <w:pPr>
+        <w:jc w:val="both"/>
         <w:rPr/>
       </w:pPr>
       <w:r>
@@ -3045,6 +3150,7 @@
     </w:p>
     <w:p>
       <w:pPr>
+        <w:jc w:val="both"/>
         <w:rPr/>
       </w:pPr>
       <w:r>
@@ -3065,6 +3171,7 @@
     </w:p>
     <w:p>
       <w:pPr>
+        <w:jc w:val="both"/>
         <w:rPr/>
       </w:pPr>
       <w:r>
@@ -3085,6 +3192,7 @@
     </w:p>
     <w:p>
       <w:pPr>
+        <w:jc w:val="both"/>
         <w:rPr/>
       </w:pPr>
       <w:r>
@@ -3105,6 +3213,7 @@
     </w:p>
     <w:p>
       <w:pPr>
+        <w:jc w:val="both"/>
         <w:rPr/>
       </w:pPr>
       <w:r>
@@ -3125,6 +3234,7 @@
     </w:p>
     <w:p>
       <w:pPr>
+        <w:jc w:val="both"/>
         <w:rPr/>
       </w:pPr>
       <w:r>
@@ -3145,6 +3255,7 @@
     </w:p>
     <w:p>
       <w:pPr>
+        <w:jc w:val="both"/>
         <w:rPr/>
       </w:pPr>
       <w:r>
@@ -3165,6 +3276,7 @@
     </w:p>
     <w:p>
       <w:pPr>
+        <w:jc w:val="both"/>
         <w:rPr/>
       </w:pPr>
       <w:r>
@@ -3234,6 +3346,7 @@
     </w:p>
     <w:p>
       <w:pPr>
+        <w:jc w:val="both"/>
         <w:rPr/>
       </w:pPr>
       <w:r>
@@ -3342,6 +3455,7 @@
     </w:p>
     <w:p>
       <w:pPr>
+        <w:jc w:val="both"/>
         <w:rPr/>
       </w:pPr>
       <w:r>
@@ -3362,6 +3476,7 @@
     </w:p>
     <w:p>
       <w:pPr>
+        <w:jc w:val="both"/>
         <w:rPr/>
       </w:pPr>
       <w:r>
@@ -3382,6 +3497,7 @@
     </w:p>
     <w:p>
       <w:pPr>
+        <w:jc w:val="both"/>
         <w:rPr/>
       </w:pPr>
       <w:r>
@@ -3402,6 +3518,7 @@
     </w:p>
     <w:p>
       <w:pPr>
+        <w:jc w:val="both"/>
         <w:rPr/>
       </w:pPr>
       <w:r>
@@ -3448,6 +3565,7 @@
     </w:p>
     <w:p>
       <w:pPr>
+        <w:jc w:val="both"/>
         <w:rPr/>
       </w:pPr>
       <w:r>
@@ -3468,6 +3586,7 @@
     </w:p>
     <w:p>
       <w:pPr>
+        <w:jc w:val="both"/>
         <w:rPr/>
       </w:pPr>
       <w:r>
@@ -3488,6 +3607,7 @@
     </w:p>
     <w:p>
       <w:pPr>
+        <w:jc w:val="both"/>
         <w:rPr/>
       </w:pPr>
       <w:r>
@@ -3508,6 +3628,7 @@
     </w:p>
     <w:p>
       <w:pPr>
+        <w:jc w:val="both"/>
         <w:rPr/>
       </w:pPr>
       <w:r>
@@ -3546,7 +3667,7 @@
         <w:shd w:fill="auto" w:val="clear"/>
         <w:spacing w:after="0" w:before="0" w:line="276" w:lineRule="auto"/>
         <w:ind w:left="360" w:right="0" w:hanging="360"/>
-        <w:jc w:val="left"/>
+        <w:jc w:val="both"/>
         <w:rPr/>
       </w:pPr>
       <w:r>
@@ -3589,7 +3710,7 @@
         <w:shd w:fill="auto" w:val="clear"/>
         <w:spacing w:after="0" w:before="0" w:line="276" w:lineRule="auto"/>
         <w:ind w:left="360" w:right="0" w:hanging="360"/>
-        <w:jc w:val="left"/>
+        <w:jc w:val="both"/>
         <w:rPr/>
       </w:pPr>
       <w:r>
@@ -3632,7 +3753,7 @@
         <w:shd w:fill="auto" w:val="clear"/>
         <w:spacing w:after="200" w:before="0" w:line="276" w:lineRule="auto"/>
         <w:ind w:left="360" w:right="0" w:hanging="360"/>
-        <w:jc w:val="left"/>
+        <w:jc w:val="both"/>
         <w:rPr/>
       </w:pPr>
       <w:r>
@@ -3657,6 +3778,7 @@
     </w:p>
     <w:p>
       <w:pPr>
+        <w:jc w:val="both"/>
         <w:rPr/>
       </w:pPr>
       <w:r>
@@ -3677,6 +3799,7 @@
     </w:p>
     <w:p>
       <w:pPr>
+        <w:jc w:val="both"/>
         <w:rPr/>
       </w:pPr>
       <w:r>
@@ -3697,6 +3820,7 @@
     </w:p>
     <w:p>
       <w:pPr>
+        <w:jc w:val="both"/>
         <w:rPr/>
       </w:pPr>
       <w:r>
@@ -3773,6 +3897,7 @@
           <w:tcPr/>
           <w:p>
             <w:pPr>
+              <w:jc w:val="both"/>
               <w:rPr/>
             </w:pPr>
             <w:r>
@@ -3794,6 +3919,7 @@
           <w:tcPr/>
           <w:p>
             <w:pPr>
+              <w:jc w:val="both"/>
               <w:rPr/>
             </w:pPr>
             <w:r>
@@ -3815,6 +3941,7 @@
           <w:tcPr/>
           <w:p>
             <w:pPr>
+              <w:jc w:val="both"/>
               <w:rPr/>
             </w:pPr>
             <w:r>
@@ -3836,6 +3963,7 @@
           <w:tcPr/>
           <w:p>
             <w:pPr>
+              <w:jc w:val="both"/>
               <w:rPr/>
             </w:pPr>
             <w:r>
@@ -3863,6 +3991,7 @@
           <w:tcPr/>
           <w:p>
             <w:pPr>
+              <w:jc w:val="both"/>
               <w:rPr/>
             </w:pPr>
             <w:r>
@@ -3877,6 +4006,7 @@
           <w:tcPr/>
           <w:p>
             <w:pPr>
+              <w:jc w:val="both"/>
               <w:rPr/>
             </w:pPr>
             <w:r>
@@ -3891,6 +4021,7 @@
           <w:tcPr/>
           <w:p>
             <w:pPr>
+              <w:jc w:val="both"/>
               <w:rPr/>
             </w:pPr>
             <w:r>
@@ -3905,6 +4036,7 @@
           <w:tcPr/>
           <w:p>
             <w:pPr>
+              <w:jc w:val="both"/>
               <w:rPr/>
             </w:pPr>
             <w:r>
@@ -3925,6 +4057,7 @@
           <w:tcPr/>
           <w:p>
             <w:pPr>
+              <w:jc w:val="both"/>
               <w:rPr/>
             </w:pPr>
             <w:r>
@@ -3939,6 +4072,7 @@
           <w:tcPr/>
           <w:p>
             <w:pPr>
+              <w:jc w:val="both"/>
               <w:rPr/>
             </w:pPr>
             <w:r>
@@ -3953,6 +4087,7 @@
           <w:tcPr/>
           <w:p>
             <w:pPr>
+              <w:jc w:val="both"/>
               <w:rPr/>
             </w:pPr>
             <w:r>
@@ -3967,6 +4102,7 @@
           <w:tcPr/>
           <w:p>
             <w:pPr>
+              <w:jc w:val="both"/>
               <w:rPr/>
             </w:pPr>
             <w:r>
@@ -3987,6 +4123,7 @@
           <w:tcPr/>
           <w:p>
             <w:pPr>
+              <w:jc w:val="both"/>
               <w:rPr/>
             </w:pPr>
             <w:r>
@@ -4001,6 +4138,7 @@
           <w:tcPr/>
           <w:p>
             <w:pPr>
+              <w:jc w:val="both"/>
               <w:rPr/>
             </w:pPr>
             <w:r>
@@ -4015,6 +4153,7 @@
           <w:tcPr/>
           <w:p>
             <w:pPr>
+              <w:jc w:val="both"/>
               <w:rPr/>
             </w:pPr>
             <w:r>
@@ -4029,6 +4168,7 @@
           <w:tcPr/>
           <w:p>
             <w:pPr>
+              <w:jc w:val="both"/>
               <w:rPr/>
             </w:pPr>
             <w:r>
@@ -4049,6 +4189,7 @@
           <w:tcPr/>
           <w:p>
             <w:pPr>
+              <w:jc w:val="both"/>
               <w:rPr/>
             </w:pPr>
             <w:r>
@@ -4063,6 +4204,7 @@
           <w:tcPr/>
           <w:p>
             <w:pPr>
+              <w:jc w:val="both"/>
               <w:rPr/>
             </w:pPr>
             <w:r>
@@ -4077,6 +4219,7 @@
           <w:tcPr/>
           <w:p>
             <w:pPr>
+              <w:jc w:val="both"/>
               <w:rPr/>
             </w:pPr>
             <w:r>
@@ -4091,6 +4234,7 @@
           <w:tcPr/>
           <w:p>
             <w:pPr>
+              <w:jc w:val="both"/>
               <w:rPr/>
             </w:pPr>
             <w:r>
@@ -4111,6 +4255,7 @@
           <w:tcPr/>
           <w:p>
             <w:pPr>
+              <w:jc w:val="both"/>
               <w:rPr/>
             </w:pPr>
             <w:r>
@@ -4125,6 +4270,7 @@
           <w:tcPr/>
           <w:p>
             <w:pPr>
+              <w:jc w:val="both"/>
               <w:rPr/>
             </w:pPr>
             <w:r>
@@ -4139,6 +4285,7 @@
           <w:tcPr/>
           <w:p>
             <w:pPr>
+              <w:jc w:val="both"/>
               <w:rPr/>
             </w:pPr>
             <w:r>
@@ -4153,6 +4300,7 @@
           <w:tcPr/>
           <w:p>
             <w:pPr>
+              <w:jc w:val="both"/>
               <w:rPr/>
             </w:pPr>
             <w:r>
@@ -4173,6 +4321,7 @@
           <w:tcPr/>
           <w:p>
             <w:pPr>
+              <w:jc w:val="both"/>
               <w:rPr/>
             </w:pPr>
             <w:r>
@@ -4187,6 +4336,7 @@
           <w:tcPr/>
           <w:p>
             <w:pPr>
+              <w:jc w:val="both"/>
               <w:rPr/>
             </w:pPr>
             <w:r>
@@ -4201,6 +4351,7 @@
           <w:tcPr/>
           <w:p>
             <w:pPr>
+              <w:jc w:val="both"/>
               <w:rPr/>
             </w:pPr>
             <w:r>
@@ -4215,6 +4366,7 @@
           <w:tcPr/>
           <w:p>
             <w:pPr>
+              <w:jc w:val="both"/>
               <w:rPr/>
             </w:pPr>
             <w:r>
@@ -4235,6 +4387,7 @@
           <w:tcPr/>
           <w:p>
             <w:pPr>
+              <w:jc w:val="both"/>
               <w:rPr/>
             </w:pPr>
             <w:r>
@@ -4249,6 +4402,7 @@
           <w:tcPr/>
           <w:p>
             <w:pPr>
+              <w:jc w:val="both"/>
               <w:rPr/>
             </w:pPr>
             <w:r>
@@ -4263,6 +4417,7 @@
           <w:tcPr/>
           <w:p>
             <w:pPr>
+              <w:jc w:val="both"/>
               <w:rPr/>
             </w:pPr>
             <w:r>
@@ -4277,6 +4432,7 @@
           <w:tcPr/>
           <w:p>
             <w:pPr>
+              <w:jc w:val="both"/>
               <w:rPr/>
             </w:pPr>
             <w:r>
@@ -4297,6 +4453,7 @@
           <w:tcPr/>
           <w:p>
             <w:pPr>
+              <w:jc w:val="both"/>
               <w:rPr/>
             </w:pPr>
             <w:r>
@@ -4311,6 +4468,7 @@
           <w:tcPr/>
           <w:p>
             <w:pPr>
+              <w:jc w:val="both"/>
               <w:rPr/>
             </w:pPr>
             <w:r>
@@ -4325,6 +4483,7 @@
           <w:tcPr/>
           <w:p>
             <w:pPr>
+              <w:jc w:val="both"/>
               <w:rPr/>
             </w:pPr>
             <w:r>
@@ -4339,6 +4498,7 @@
           <w:tcPr/>
           <w:p>
             <w:pPr>
+              <w:jc w:val="both"/>
               <w:rPr/>
             </w:pPr>
             <w:r>
@@ -4359,6 +4519,7 @@
           <w:tcPr/>
           <w:p>
             <w:pPr>
+              <w:jc w:val="both"/>
               <w:rPr/>
             </w:pPr>
             <w:r>
@@ -4373,6 +4534,7 @@
           <w:tcPr/>
           <w:p>
             <w:pPr>
+              <w:jc w:val="both"/>
               <w:rPr/>
             </w:pPr>
             <w:r>
@@ -4387,6 +4549,7 @@
           <w:tcPr/>
           <w:p>
             <w:pPr>
+              <w:jc w:val="both"/>
               <w:rPr/>
             </w:pPr>
             <w:r>
@@ -4401,6 +4564,7 @@
           <w:tcPr/>
           <w:p>
             <w:pPr>
+              <w:jc w:val="both"/>
               <w:rPr/>
             </w:pPr>
             <w:r>
@@ -4421,6 +4585,7 @@
           <w:tcPr/>
           <w:p>
             <w:pPr>
+              <w:jc w:val="both"/>
               <w:rPr/>
             </w:pPr>
             <w:r>
@@ -4435,6 +4600,7 @@
           <w:tcPr/>
           <w:p>
             <w:pPr>
+              <w:jc w:val="both"/>
               <w:rPr/>
             </w:pPr>
             <w:r>
@@ -4449,6 +4615,7 @@
           <w:tcPr/>
           <w:p>
             <w:pPr>
+              <w:jc w:val="both"/>
               <w:rPr/>
             </w:pPr>
             <w:r>
@@ -4463,6 +4630,7 @@
           <w:tcPr/>
           <w:p>
             <w:pPr>
+              <w:jc w:val="both"/>
               <w:rPr/>
             </w:pPr>
             <w:r>
@@ -4483,6 +4651,7 @@
           <w:tcPr/>
           <w:p>
             <w:pPr>
+              <w:jc w:val="both"/>
               <w:rPr/>
             </w:pPr>
             <w:r>
@@ -4497,6 +4666,7 @@
           <w:tcPr/>
           <w:p>
             <w:pPr>
+              <w:jc w:val="both"/>
               <w:rPr/>
             </w:pPr>
             <w:r>
@@ -4511,6 +4681,7 @@
           <w:tcPr/>
           <w:p>
             <w:pPr>
+              <w:jc w:val="both"/>
               <w:rPr/>
             </w:pPr>
             <w:r>
@@ -4525,6 +4696,7 @@
           <w:tcPr/>
           <w:p>
             <w:pPr>
+              <w:jc w:val="both"/>
               <w:rPr/>
             </w:pPr>
             <w:r>
@@ -4598,6 +4770,7 @@
     </w:p>
     <w:p>
       <w:pPr>
+        <w:jc w:val="both"/>
         <w:rPr/>
       </w:pPr>
       <w:r>
@@ -4636,7 +4809,7 @@
         <w:shd w:fill="auto" w:val="clear"/>
         <w:spacing w:after="0" w:before="0" w:line="276" w:lineRule="auto"/>
         <w:ind w:left="360" w:right="0" w:hanging="360"/>
-        <w:jc w:val="left"/>
+        <w:jc w:val="both"/>
         <w:rPr/>
       </w:pPr>
       <w:r>
@@ -4679,7 +4852,7 @@
         <w:shd w:fill="auto" w:val="clear"/>
         <w:spacing w:after="0" w:before="0" w:line="276" w:lineRule="auto"/>
         <w:ind w:left="360" w:right="0" w:hanging="360"/>
-        <w:jc w:val="left"/>
+        <w:jc w:val="both"/>
         <w:rPr/>
       </w:pPr>
       <w:r>
@@ -4722,7 +4895,7 @@
         <w:shd w:fill="auto" w:val="clear"/>
         <w:spacing w:after="0" w:before="0" w:line="276" w:lineRule="auto"/>
         <w:ind w:left="360" w:right="0" w:hanging="360"/>
-        <w:jc w:val="left"/>
+        <w:jc w:val="both"/>
         <w:rPr/>
       </w:pPr>
       <w:r>
@@ -4765,7 +4938,7 @@
         <w:shd w:fill="auto" w:val="clear"/>
         <w:spacing w:after="200" w:before="0" w:line="276" w:lineRule="auto"/>
         <w:ind w:left="360" w:right="0" w:hanging="360"/>
-        <w:jc w:val="left"/>
+        <w:jc w:val="both"/>
         <w:rPr/>
       </w:pPr>
       <w:r>
@@ -4790,6 +4963,7 @@
     </w:p>
     <w:p>
       <w:pPr>
+        <w:jc w:val="both"/>
         <w:rPr/>
       </w:pPr>
       <w:r>
@@ -4828,7 +5002,7 @@
         <w:shd w:fill="auto" w:val="clear"/>
         <w:spacing w:after="0" w:before="0" w:line="276" w:lineRule="auto"/>
         <w:ind w:left="360" w:right="0" w:hanging="360"/>
-        <w:jc w:val="left"/>
+        <w:jc w:val="both"/>
         <w:rPr/>
       </w:pPr>
       <w:r>
@@ -4871,7 +5045,7 @@
         <w:shd w:fill="auto" w:val="clear"/>
         <w:spacing w:after="0" w:before="0" w:line="276" w:lineRule="auto"/>
         <w:ind w:left="360" w:right="0" w:hanging="360"/>
-        <w:jc w:val="left"/>
+        <w:jc w:val="both"/>
         <w:rPr/>
       </w:pPr>
       <w:r>
@@ -4914,7 +5088,7 @@
         <w:shd w:fill="auto" w:val="clear"/>
         <w:spacing w:after="0" w:before="0" w:line="276" w:lineRule="auto"/>
         <w:ind w:left="360" w:right="0" w:hanging="360"/>
-        <w:jc w:val="left"/>
+        <w:jc w:val="both"/>
         <w:rPr/>
       </w:pPr>
       <w:r>
@@ -4957,7 +5131,7 @@
         <w:shd w:fill="auto" w:val="clear"/>
         <w:spacing w:after="200" w:before="0" w:line="276" w:lineRule="auto"/>
         <w:ind w:left="360" w:right="0" w:hanging="360"/>
-        <w:jc w:val="left"/>
+        <w:jc w:val="both"/>
         <w:rPr/>
       </w:pPr>
       <w:r>
@@ -5000,6 +5174,7 @@
     </w:p>
     <w:p>
       <w:pPr>
+        <w:jc w:val="both"/>
         <w:rPr/>
       </w:pPr>
       <w:r>
@@ -5056,6 +5231,7 @@
           <w:tcPr/>
           <w:p>
             <w:pPr>
+              <w:jc w:val="both"/>
               <w:rPr/>
             </w:pPr>
             <w:r>
@@ -5077,6 +5253,7 @@
           <w:tcPr/>
           <w:p>
             <w:pPr>
+              <w:jc w:val="both"/>
               <w:rPr/>
             </w:pPr>
             <w:r>
@@ -5098,6 +5275,7 @@
           <w:tcPr/>
           <w:p>
             <w:pPr>
+              <w:jc w:val="both"/>
               <w:rPr/>
             </w:pPr>
             <w:r>
@@ -5125,6 +5303,7 @@
           <w:tcPr/>
           <w:p>
             <w:pPr>
+              <w:jc w:val="both"/>
               <w:rPr/>
             </w:pPr>
             <w:r>
@@ -5139,6 +5318,7 @@
           <w:tcPr/>
           <w:p>
             <w:pPr>
+              <w:jc w:val="both"/>
               <w:rPr/>
             </w:pPr>
             <w:r>
@@ -5153,6 +5333,7 @@
           <w:tcPr/>
           <w:p>
             <w:pPr>
+              <w:jc w:val="both"/>
               <w:rPr/>
             </w:pPr>
             <w:r>
@@ -5173,6 +5354,7 @@
           <w:tcPr/>
           <w:p>
             <w:pPr>
+              <w:jc w:val="both"/>
               <w:rPr/>
             </w:pPr>
             <w:r>
@@ -5187,6 +5369,7 @@
           <w:tcPr/>
           <w:p>
             <w:pPr>
+              <w:jc w:val="both"/>
               <w:rPr/>
             </w:pPr>
             <w:r>
@@ -5201,6 +5384,7 @@
           <w:tcPr/>
           <w:p>
             <w:pPr>
+              <w:jc w:val="both"/>
               <w:rPr/>
             </w:pPr>
             <w:r>
@@ -5221,6 +5405,7 @@
           <w:tcPr/>
           <w:p>
             <w:pPr>
+              <w:jc w:val="both"/>
               <w:rPr/>
             </w:pPr>
             <w:r>
@@ -5235,6 +5420,7 @@
           <w:tcPr/>
           <w:p>
             <w:pPr>
+              <w:jc w:val="both"/>
               <w:rPr/>
             </w:pPr>
             <w:r>
@@ -5249,6 +5435,7 @@
           <w:tcPr/>
           <w:p>
             <w:pPr>
+              <w:jc w:val="both"/>
               <w:rPr/>
             </w:pPr>
             <w:r>
@@ -5269,6 +5456,7 @@
           <w:tcPr/>
           <w:p>
             <w:pPr>
+              <w:jc w:val="both"/>
               <w:rPr/>
             </w:pPr>
             <w:r>
@@ -5283,6 +5471,7 @@
           <w:tcPr/>
           <w:p>
             <w:pPr>
+              <w:jc w:val="both"/>
               <w:rPr/>
             </w:pPr>
             <w:r>
@@ -5297,6 +5486,7 @@
           <w:tcPr/>
           <w:p>
             <w:pPr>
+              <w:jc w:val="both"/>
               <w:rPr/>
             </w:pPr>
             <w:r>
@@ -5365,6 +5555,7 @@
     </w:p>
     <w:p>
       <w:pPr>
+        <w:jc w:val="both"/>
         <w:rPr/>
       </w:pPr>
       <w:r>
@@ -5423,6 +5614,7 @@
           <w:tcPr/>
           <w:p>
             <w:pPr>
+              <w:jc w:val="both"/>
               <w:rPr/>
             </w:pPr>
             <w:r>
@@ -5444,6 +5636,7 @@
           <w:tcPr/>
           <w:p>
             <w:pPr>
+              <w:jc w:val="both"/>
               <w:rPr/>
             </w:pPr>
             <w:r>
@@ -5465,6 +5658,7 @@
           <w:tcPr/>
           <w:p>
             <w:pPr>
+              <w:jc w:val="both"/>
               <w:rPr/>
             </w:pPr>
             <w:r>
@@ -5486,6 +5680,7 @@
           <w:tcPr/>
           <w:p>
             <w:pPr>
+              <w:jc w:val="both"/>
               <w:rPr/>
             </w:pPr>
             <w:r>
@@ -5513,6 +5708,7 @@
           <w:tcPr/>
           <w:p>
             <w:pPr>
+              <w:jc w:val="both"/>
               <w:rPr/>
             </w:pPr>
             <w:r>
@@ -5527,6 +5723,7 @@
           <w:tcPr/>
           <w:p>
             <w:pPr>
+              <w:jc w:val="both"/>
               <w:rPr/>
             </w:pPr>
             <w:r>
@@ -5541,6 +5738,7 @@
           <w:tcPr/>
           <w:p>
             <w:pPr>
+              <w:jc w:val="both"/>
               <w:rPr/>
             </w:pPr>
             <w:r>
@@ -5555,6 +5753,7 @@
           <w:tcPr/>
           <w:p>
             <w:pPr>
+              <w:jc w:val="both"/>
               <w:rPr/>
             </w:pPr>
             <w:r>
@@ -5575,6 +5774,7 @@
           <w:tcPr/>
           <w:p>
             <w:pPr>
+              <w:jc w:val="both"/>
               <w:rPr/>
             </w:pPr>
             <w:r>
@@ -5589,6 +5789,7 @@
           <w:tcPr/>
           <w:p>
             <w:pPr>
+              <w:jc w:val="both"/>
               <w:rPr/>
             </w:pPr>
             <w:r>
@@ -5603,6 +5804,7 @@
           <w:tcPr/>
           <w:p>
             <w:pPr>
+              <w:jc w:val="both"/>
               <w:rPr/>
             </w:pPr>
             <w:r>
@@ -5617,6 +5819,7 @@
           <w:tcPr/>
           <w:p>
             <w:pPr>
+              <w:jc w:val="both"/>
               <w:rPr/>
             </w:pPr>
             <w:r>
@@ -5637,6 +5840,7 @@
           <w:tcPr/>
           <w:p>
             <w:pPr>
+              <w:jc w:val="both"/>
               <w:rPr/>
             </w:pPr>
             <w:r>
@@ -5651,6 +5855,7 @@
           <w:tcPr/>
           <w:p>
             <w:pPr>
+              <w:jc w:val="both"/>
               <w:rPr/>
             </w:pPr>
             <w:r>
@@ -5665,6 +5870,7 @@
           <w:tcPr/>
           <w:p>
             <w:pPr>
+              <w:jc w:val="both"/>
               <w:rPr/>
             </w:pPr>
             <w:r>
@@ -5679,6 +5885,7 @@
           <w:tcPr/>
           <w:p>
             <w:pPr>
+              <w:jc w:val="both"/>
               <w:rPr/>
             </w:pPr>
             <w:r>
@@ -5699,6 +5906,7 @@
           <w:tcPr/>
           <w:p>
             <w:pPr>
+              <w:jc w:val="both"/>
               <w:rPr/>
             </w:pPr>
             <w:r>
@@ -5713,6 +5921,7 @@
           <w:tcPr/>
           <w:p>
             <w:pPr>
+              <w:jc w:val="both"/>
               <w:rPr/>
             </w:pPr>
             <w:r>
@@ -5727,6 +5936,7 @@
           <w:tcPr/>
           <w:p>
             <w:pPr>
+              <w:jc w:val="both"/>
               <w:rPr/>
             </w:pPr>
             <w:r>
@@ -5741,6 +5951,7 @@
           <w:tcPr/>
           <w:p>
             <w:pPr>
+              <w:jc w:val="both"/>
               <w:rPr/>
             </w:pPr>
             <w:r>
@@ -5761,6 +5972,7 @@
           <w:tcPr/>
           <w:p>
             <w:pPr>
+              <w:jc w:val="both"/>
               <w:rPr/>
             </w:pPr>
             <w:r>
@@ -5775,6 +5987,7 @@
           <w:tcPr/>
           <w:p>
             <w:pPr>
+              <w:jc w:val="both"/>
               <w:rPr/>
             </w:pPr>
             <w:r>
@@ -5789,6 +6002,7 @@
           <w:tcPr/>
           <w:p>
             <w:pPr>
+              <w:jc w:val="both"/>
               <w:rPr/>
             </w:pPr>
             <w:r>
@@ -5803,6 +6017,7 @@
           <w:tcPr/>
           <w:p>
             <w:pPr>
+              <w:jc w:val="both"/>
               <w:rPr/>
             </w:pPr>
             <w:r>
@@ -5823,6 +6038,7 @@
           <w:tcPr/>
           <w:p>
             <w:pPr>
+              <w:jc w:val="both"/>
               <w:rPr/>
             </w:pPr>
             <w:r>
@@ -5837,6 +6053,7 @@
           <w:tcPr/>
           <w:p>
             <w:pPr>
+              <w:jc w:val="both"/>
               <w:rPr/>
             </w:pPr>
             <w:r>
@@ -5851,6 +6068,7 @@
           <w:tcPr/>
           <w:p>
             <w:pPr>
+              <w:jc w:val="both"/>
               <w:rPr/>
             </w:pPr>
             <w:r>
@@ -5865,6 +6083,7 @@
           <w:tcPr/>
           <w:p>
             <w:pPr>
+              <w:jc w:val="both"/>
               <w:rPr/>
             </w:pPr>
             <w:r>
@@ -5885,6 +6104,7 @@
           <w:tcPr/>
           <w:p>
             <w:pPr>
+              <w:jc w:val="both"/>
               <w:rPr/>
             </w:pPr>
             <w:r>
@@ -5899,6 +6119,7 @@
           <w:tcPr/>
           <w:p>
             <w:pPr>
+              <w:jc w:val="both"/>
               <w:rPr/>
             </w:pPr>
             <w:r>
@@ -5913,6 +6134,7 @@
           <w:tcPr/>
           <w:p>
             <w:pPr>
+              <w:jc w:val="both"/>
               <w:rPr/>
             </w:pPr>
             <w:r>
@@ -5927,6 +6149,7 @@
           <w:tcPr/>
           <w:p>
             <w:pPr>
+              <w:jc w:val="both"/>
               <w:rPr/>
             </w:pPr>
             <w:r>
@@ -5947,6 +6170,7 @@
           <w:tcPr/>
           <w:p>
             <w:pPr>
+              <w:jc w:val="both"/>
               <w:rPr/>
             </w:pPr>
             <w:r>
@@ -5961,6 +6185,7 @@
           <w:tcPr/>
           <w:p>
             <w:pPr>
+              <w:jc w:val="both"/>
               <w:rPr/>
             </w:pPr>
             <w:r>
@@ -5975,6 +6200,7 @@
           <w:tcPr/>
           <w:p>
             <w:pPr>
+              <w:jc w:val="both"/>
               <w:rPr/>
             </w:pPr>
             <w:r>
@@ -5989,6 +6215,7 @@
           <w:tcPr/>
           <w:p>
             <w:pPr>
+              <w:jc w:val="both"/>
               <w:rPr/>
             </w:pPr>
             <w:r>
@@ -6009,6 +6236,7 @@
           <w:tcPr/>
           <w:p>
             <w:pPr>
+              <w:jc w:val="both"/>
               <w:rPr/>
             </w:pPr>
             <w:r>
@@ -6023,6 +6251,7 @@
           <w:tcPr/>
           <w:p>
             <w:pPr>
+              <w:jc w:val="both"/>
               <w:rPr/>
             </w:pPr>
             <w:r>
@@ -6037,6 +6266,7 @@
           <w:tcPr/>
           <w:p>
             <w:pPr>
+              <w:jc w:val="both"/>
               <w:rPr/>
             </w:pPr>
             <w:r>
@@ -6051,6 +6281,7 @@
           <w:tcPr/>
           <w:p>
             <w:pPr>
+              <w:jc w:val="both"/>
               <w:rPr/>
             </w:pPr>
             <w:r>
@@ -6075,6 +6306,7 @@
     </w:p>
     <w:p>
       <w:pPr>
+        <w:jc w:val="both"/>
         <w:rPr/>
       </w:pPr>
       <w:r>
@@ -6113,7 +6345,7 @@
         <w:shd w:fill="auto" w:val="clear"/>
         <w:spacing w:after="0" w:before="0" w:line="276" w:lineRule="auto"/>
         <w:ind w:left="360" w:right="0" w:hanging="360"/>
-        <w:jc w:val="left"/>
+        <w:jc w:val="both"/>
         <w:rPr/>
       </w:pPr>
       <w:r>
@@ -6156,7 +6388,7 @@
         <w:shd w:fill="auto" w:val="clear"/>
         <w:spacing w:after="0" w:before="0" w:line="276" w:lineRule="auto"/>
         <w:ind w:left="360" w:right="0" w:hanging="360"/>
-        <w:jc w:val="left"/>
+        <w:jc w:val="both"/>
         <w:rPr/>
       </w:pPr>
       <w:r>
@@ -6299,7 +6531,7 @@
         <w:shd w:fill="auto" w:val="clear"/>
         <w:spacing w:after="0" w:before="0" w:line="276" w:lineRule="auto"/>
         <w:ind w:left="360" w:right="0" w:hanging="360"/>
-        <w:jc w:val="left"/>
+        <w:jc w:val="both"/>
         <w:rPr/>
       </w:pPr>
       <w:r>
@@ -6342,7 +6574,7 @@
         <w:shd w:fill="auto" w:val="clear"/>
         <w:spacing w:after="0" w:before="0" w:line="276" w:lineRule="auto"/>
         <w:ind w:left="360" w:right="0" w:hanging="360"/>
-        <w:jc w:val="left"/>
+        <w:jc w:val="both"/>
         <w:rPr/>
       </w:pPr>
       <w:r>
@@ -6385,7 +6617,7 @@
         <w:shd w:fill="auto" w:val="clear"/>
         <w:spacing w:after="200" w:before="0" w:line="276" w:lineRule="auto"/>
         <w:ind w:left="360" w:right="0" w:hanging="360"/>
-        <w:jc w:val="left"/>
+        <w:jc w:val="both"/>
         <w:rPr/>
       </w:pPr>
       <w:r>
@@ -6428,6 +6660,7 @@
     </w:p>
     <w:p>
       <w:pPr>
+        <w:jc w:val="both"/>
         <w:rPr/>
       </w:pPr>
       <w:r>
@@ -6448,6 +6681,7 @@
     </w:p>
     <w:p>
       <w:pPr>
+        <w:jc w:val="both"/>
         <w:rPr/>
       </w:pPr>
       <w:r>
@@ -6486,7 +6720,7 @@
         <w:shd w:fill="auto" w:val="clear"/>
         <w:spacing w:after="0" w:before="0" w:line="276" w:lineRule="auto"/>
         <w:ind w:left="360" w:right="0" w:hanging="360"/>
-        <w:jc w:val="left"/>
+        <w:jc w:val="both"/>
         <w:rPr/>
       </w:pPr>
       <w:r>
@@ -6529,7 +6763,7 @@
         <w:shd w:fill="auto" w:val="clear"/>
         <w:spacing w:after="0" w:before="0" w:line="276" w:lineRule="auto"/>
         <w:ind w:left="360" w:right="0" w:hanging="360"/>
-        <w:jc w:val="left"/>
+        <w:jc w:val="both"/>
         <w:rPr/>
       </w:pPr>
       <w:r>
@@ -6572,7 +6806,7 @@
         <w:shd w:fill="auto" w:val="clear"/>
         <w:spacing w:after="0" w:before="0" w:line="276" w:lineRule="auto"/>
         <w:ind w:left="360" w:right="0" w:hanging="360"/>
-        <w:jc w:val="left"/>
+        <w:jc w:val="both"/>
         <w:rPr/>
       </w:pPr>
       <w:r>
@@ -6615,7 +6849,7 @@
         <w:shd w:fill="auto" w:val="clear"/>
         <w:spacing w:after="200" w:before="0" w:line="276" w:lineRule="auto"/>
         <w:ind w:left="360" w:right="0" w:hanging="360"/>
-        <w:jc w:val="left"/>
+        <w:jc w:val="both"/>
         <w:rPr/>
       </w:pPr>
       <w:r>
@@ -6640,6 +6874,7 @@
     </w:p>
     <w:p>
       <w:pPr>
+        <w:jc w:val="both"/>
         <w:rPr/>
       </w:pPr>
       <w:r>
@@ -6678,7 +6913,7 @@
         <w:shd w:fill="auto" w:val="clear"/>
         <w:spacing w:after="0" w:before="0" w:line="276" w:lineRule="auto"/>
         <w:ind w:left="360" w:right="0" w:hanging="360"/>
-        <w:jc w:val="left"/>
+        <w:jc w:val="both"/>
         <w:rPr/>
       </w:pPr>
       <w:r>
@@ -6721,7 +6956,7 @@
         <w:shd w:fill="auto" w:val="clear"/>
         <w:spacing w:after="0" w:before="0" w:line="276" w:lineRule="auto"/>
         <w:ind w:left="360" w:right="0" w:hanging="360"/>
-        <w:jc w:val="left"/>
+        <w:jc w:val="both"/>
         <w:rPr/>
       </w:pPr>
       <w:r>
@@ -6764,7 +6999,7 @@
         <w:shd w:fill="auto" w:val="clear"/>
         <w:spacing w:after="0" w:before="0" w:line="276" w:lineRule="auto"/>
         <w:ind w:left="360" w:right="0" w:hanging="360"/>
-        <w:jc w:val="left"/>
+        <w:jc w:val="both"/>
         <w:rPr/>
       </w:pPr>
       <w:r>
@@ -6807,7 +7042,7 @@
         <w:shd w:fill="auto" w:val="clear"/>
         <w:spacing w:after="0" w:before="0" w:line="276" w:lineRule="auto"/>
         <w:ind w:left="360" w:right="0" w:hanging="360"/>
-        <w:jc w:val="left"/>
+        <w:jc w:val="both"/>
         <w:rPr/>
       </w:pPr>
       <w:r>
@@ -6850,7 +7085,7 @@
         <w:shd w:fill="auto" w:val="clear"/>
         <w:spacing w:after="200" w:before="0" w:line="276" w:lineRule="auto"/>
         <w:ind w:left="360" w:right="0" w:hanging="360"/>
-        <w:jc w:val="left"/>
+        <w:jc w:val="both"/>
         <w:rPr/>
       </w:pPr>
       <w:r>
@@ -6924,6 +7159,7 @@
     </w:p>
     <w:p>
       <w:pPr>
+        <w:jc w:val="both"/>
         <w:rPr/>
       </w:pPr>
       <w:r>
@@ -6962,7 +7198,7 @@
         <w:shd w:fill="auto" w:val="clear"/>
         <w:spacing w:after="0" w:before="0" w:line="276" w:lineRule="auto"/>
         <w:ind w:left="360" w:right="0" w:hanging="360"/>
-        <w:jc w:val="left"/>
+        <w:jc w:val="both"/>
         <w:rPr/>
       </w:pPr>
       <w:r>
@@ -7005,7 +7241,7 @@
         <w:shd w:fill="auto" w:val="clear"/>
         <w:spacing w:after="0" w:before="0" w:line="276" w:lineRule="auto"/>
         <w:ind w:left="360" w:right="0" w:hanging="360"/>
-        <w:jc w:val="left"/>
+        <w:jc w:val="both"/>
         <w:rPr/>
       </w:pPr>
       <w:r>
@@ -7048,7 +7284,7 @@
         <w:shd w:fill="auto" w:val="clear"/>
         <w:spacing w:after="0" w:before="0" w:line="276" w:lineRule="auto"/>
         <w:ind w:left="360" w:right="0" w:hanging="360"/>
-        <w:jc w:val="left"/>
+        <w:jc w:val="both"/>
         <w:rPr/>
       </w:pPr>
       <w:r>
@@ -7091,7 +7327,7 @@
         <w:shd w:fill="auto" w:val="clear"/>
         <w:spacing w:after="200" w:before="0" w:line="276" w:lineRule="auto"/>
         <w:ind w:left="360" w:right="0" w:hanging="360"/>
-        <w:jc w:val="left"/>
+        <w:jc w:val="both"/>
         <w:rPr/>
       </w:pPr>
       <w:r>
@@ -7134,6 +7370,7 @@
     </w:p>
     <w:p>
       <w:pPr>
+        <w:jc w:val="both"/>
         <w:rPr/>
       </w:pPr>
       <w:r>
@@ -7172,7 +7409,7 @@
         <w:shd w:fill="auto" w:val="clear"/>
         <w:spacing w:after="0" w:before="0" w:line="276" w:lineRule="auto"/>
         <w:ind w:left="360" w:right="0" w:hanging="360"/>
-        <w:jc w:val="left"/>
+        <w:jc w:val="both"/>
         <w:rPr/>
       </w:pPr>
       <w:r>
@@ -7215,7 +7452,7 @@
         <w:shd w:fill="auto" w:val="clear"/>
         <w:spacing w:after="0" w:before="0" w:line="276" w:lineRule="auto"/>
         <w:ind w:left="360" w:right="0" w:hanging="360"/>
-        <w:jc w:val="left"/>
+        <w:jc w:val="both"/>
         <w:rPr/>
       </w:pPr>
       <w:r>
@@ -7258,7 +7495,7 @@
         <w:shd w:fill="auto" w:val="clear"/>
         <w:spacing w:after="0" w:before="0" w:line="276" w:lineRule="auto"/>
         <w:ind w:left="360" w:right="0" w:hanging="360"/>
-        <w:jc w:val="left"/>
+        <w:jc w:val="both"/>
         <w:rPr/>
       </w:pPr>
       <w:r>
@@ -7301,7 +7538,7 @@
         <w:shd w:fill="auto" w:val="clear"/>
         <w:spacing w:after="0" w:before="0" w:line="276" w:lineRule="auto"/>
         <w:ind w:left="360" w:right="0" w:hanging="360"/>
-        <w:jc w:val="left"/>
+        <w:jc w:val="both"/>
         <w:rPr/>
       </w:pPr>
       <w:r>
@@ -7344,7 +7581,7 @@
         <w:shd w:fill="auto" w:val="clear"/>
         <w:spacing w:after="200" w:before="0" w:line="276" w:lineRule="auto"/>
         <w:ind w:left="360" w:right="0" w:hanging="360"/>
-        <w:jc w:val="left"/>
+        <w:jc w:val="both"/>
         <w:rPr/>
       </w:pPr>
       <w:r>
@@ -7419,7 +7656,7 @@
         <w:shd w:fill="auto" w:val="clear"/>
         <w:spacing w:after="0" w:before="0" w:line="276" w:lineRule="auto"/>
         <w:ind w:left="360" w:right="0" w:hanging="360"/>
-        <w:jc w:val="left"/>
+        <w:jc w:val="both"/>
         <w:rPr/>
       </w:pPr>
       <w:r>
@@ -7462,7 +7699,7 @@
         <w:shd w:fill="auto" w:val="clear"/>
         <w:spacing w:after="0" w:before="0" w:line="276" w:lineRule="auto"/>
         <w:ind w:left="360" w:right="0" w:hanging="360"/>
-        <w:jc w:val="left"/>
+        <w:jc w:val="both"/>
         <w:rPr/>
       </w:pPr>
       <w:r>
@@ -7505,7 +7742,7 @@
         <w:shd w:fill="auto" w:val="clear"/>
         <w:spacing w:after="200" w:before="0" w:line="276" w:lineRule="auto"/>
         <w:ind w:left="360" w:right="0" w:hanging="360"/>
-        <w:jc w:val="left"/>
+        <w:jc w:val="both"/>
         <w:rPr/>
       </w:pPr>
       <w:r>
@@ -7579,7 +7816,7 @@
         <w:shd w:fill="auto" w:val="clear"/>
         <w:spacing w:after="0" w:before="0" w:line="276" w:lineRule="auto"/>
         <w:ind w:left="360" w:right="0" w:hanging="360"/>
-        <w:jc w:val="left"/>
+        <w:jc w:val="both"/>
         <w:rPr/>
       </w:pPr>
       <w:r>
@@ -7622,7 +7859,7 @@
         <w:shd w:fill="auto" w:val="clear"/>
         <w:spacing w:after="0" w:before="0" w:line="276" w:lineRule="auto"/>
         <w:ind w:left="360" w:right="0" w:hanging="360"/>
-        <w:jc w:val="left"/>
+        <w:jc w:val="both"/>
         <w:rPr/>
       </w:pPr>
       <w:r>
@@ -7665,7 +7902,7 @@
         <w:shd w:fill="auto" w:val="clear"/>
         <w:spacing w:after="0" w:before="0" w:line="276" w:lineRule="auto"/>
         <w:ind w:left="360" w:right="0" w:hanging="360"/>
-        <w:jc w:val="left"/>
+        <w:jc w:val="both"/>
         <w:rPr/>
       </w:pPr>
       <w:r>
@@ -7708,7 +7945,7 @@
         <w:shd w:fill="auto" w:val="clear"/>
         <w:spacing w:after="0" w:before="0" w:line="276" w:lineRule="auto"/>
         <w:ind w:left="360" w:right="0" w:hanging="360"/>
-        <w:jc w:val="left"/>
+        <w:jc w:val="both"/>
         <w:rPr/>
       </w:pPr>
       <w:r>
@@ -7751,7 +7988,7 @@
         <w:shd w:fill="auto" w:val="clear"/>
         <w:spacing w:after="200" w:before="0" w:line="276" w:lineRule="auto"/>
         <w:ind w:left="360" w:right="0" w:hanging="360"/>
-        <w:jc w:val="left"/>
+        <w:jc w:val="both"/>
         <w:rPr/>
       </w:pPr>
       <w:r>
@@ -7812,7 +8049,7 @@
         <w:shd w:fill="auto" w:val="clear"/>
         <w:spacing w:after="0" w:before="0" w:line="276" w:lineRule="auto"/>
         <w:ind w:left="360" w:right="0" w:hanging="360"/>
-        <w:jc w:val="left"/>
+        <w:jc w:val="both"/>
         <w:rPr/>
       </w:pPr>
       <w:r>
@@ -7855,7 +8092,7 @@
         <w:shd w:fill="auto" w:val="clear"/>
         <w:spacing w:after="0" w:before="0" w:line="276" w:lineRule="auto"/>
         <w:ind w:left="360" w:right="0" w:hanging="360"/>
-        <w:jc w:val="left"/>
+        <w:jc w:val="both"/>
         <w:rPr/>
       </w:pPr>
       <w:r>
@@ -7898,7 +8135,7 @@
         <w:shd w:fill="auto" w:val="clear"/>
         <w:spacing w:after="200" w:before="0" w:line="276" w:lineRule="auto"/>
         <w:ind w:left="360" w:right="0" w:hanging="360"/>
-        <w:jc w:val="left"/>
+        <w:jc w:val="both"/>
         <w:rPr/>
       </w:pPr>
       <w:r>
@@ -7954,6 +8191,7 @@
     </w:p>
     <w:p>
       <w:pPr>
+        <w:jc w:val="both"/>
         <w:rPr/>
       </w:pPr>
       <w:r>
@@ -7974,6 +8212,7 @@
     </w:p>
     <w:p>
       <w:pPr>
+        <w:jc w:val="both"/>
         <w:rPr/>
       </w:pPr>
       <w:r>
@@ -7994,6 +8233,7 @@
     </w:p>
     <w:p>
       <w:pPr>
+        <w:jc w:val="both"/>
         <w:rPr/>
       </w:pPr>
       <w:r>
@@ -8014,6 +8254,7 @@
     </w:p>
     <w:p>
       <w:pPr>
+        <w:jc w:val="both"/>
         <w:rPr/>
       </w:pPr>
       <w:r>
@@ -8034,6 +8275,7 @@
     </w:p>
     <w:p>
       <w:pPr>
+        <w:jc w:val="both"/>
         <w:rPr/>
       </w:pPr>
       <w:r>
@@ -8054,6 +8296,7 @@
     </w:p>
     <w:p>
       <w:pPr>
+        <w:jc w:val="both"/>
         <w:rPr/>
       </w:pPr>
       <w:r>
@@ -8074,6 +8317,7 @@
     </w:p>
     <w:p>
       <w:pPr>
+        <w:jc w:val="both"/>
         <w:rPr/>
       </w:pPr>
       <w:r>
@@ -8143,6 +8387,7 @@
     </w:p>
     <w:p>
       <w:pPr>
+        <w:jc w:val="both"/>
         <w:rPr/>
       </w:pPr>
       <w:r>
@@ -8186,6 +8431,7 @@
     </w:p>
     <w:p>
       <w:pPr>
+        <w:jc w:val="both"/>
         <w:rPr/>
       </w:pPr>
       <w:r>
@@ -8224,7 +8470,7 @@
         <w:shd w:fill="auto" w:val="clear"/>
         <w:spacing w:after="0" w:before="0" w:line="276" w:lineRule="auto"/>
         <w:ind w:left="360" w:right="0" w:hanging="360"/>
-        <w:jc w:val="left"/>
+        <w:jc w:val="both"/>
         <w:rPr/>
       </w:pPr>
       <w:r>
@@ -8267,7 +8513,7 @@
         <w:shd w:fill="auto" w:val="clear"/>
         <w:spacing w:after="0" w:before="0" w:line="276" w:lineRule="auto"/>
         <w:ind w:left="360" w:right="0" w:hanging="360"/>
-        <w:jc w:val="left"/>
+        <w:jc w:val="both"/>
         <w:rPr/>
       </w:pPr>
       <w:r>
@@ -8310,7 +8556,7 @@
         <w:shd w:fill="auto" w:val="clear"/>
         <w:spacing w:after="0" w:before="0" w:line="276" w:lineRule="auto"/>
         <w:ind w:left="360" w:right="0" w:hanging="360"/>
-        <w:jc w:val="left"/>
+        <w:jc w:val="both"/>
         <w:rPr/>
       </w:pPr>
       <w:r>
@@ -8353,7 +8599,7 @@
         <w:shd w:fill="auto" w:val="clear"/>
         <w:spacing w:after="0" w:before="0" w:line="276" w:lineRule="auto"/>
         <w:ind w:left="360" w:right="0" w:hanging="360"/>
-        <w:jc w:val="left"/>
+        <w:jc w:val="both"/>
         <w:rPr/>
       </w:pPr>
       <w:r>
@@ -8396,7 +8642,7 @@
         <w:shd w:fill="auto" w:val="clear"/>
         <w:spacing w:after="0" w:before="0" w:line="276" w:lineRule="auto"/>
         <w:ind w:left="360" w:right="0" w:hanging="360"/>
-        <w:jc w:val="left"/>
+        <w:jc w:val="both"/>
         <w:rPr/>
       </w:pPr>
       <w:r>
@@ -8439,7 +8685,7 @@
         <w:shd w:fill="auto" w:val="clear"/>
         <w:spacing w:after="200" w:before="0" w:line="276" w:lineRule="auto"/>
         <w:ind w:left="360" w:right="0" w:hanging="360"/>
-        <w:jc w:val="left"/>
+        <w:jc w:val="both"/>
         <w:rPr/>
       </w:pPr>
       <w:r>
@@ -8555,6 +8801,7 @@
     </w:p>
     <w:p>
       <w:pPr>
+        <w:jc w:val="both"/>
         <w:rPr/>
       </w:pPr>
       <w:r>
@@ -8575,6 +8822,7 @@
     </w:p>
     <w:p>
       <w:pPr>
+        <w:jc w:val="both"/>
         <w:rPr/>
       </w:pPr>
       <w:r>
@@ -8595,6 +8843,7 @@
     </w:p>
     <w:p>
       <w:pPr>
+        <w:jc w:val="both"/>
         <w:rPr/>
       </w:pPr>
       <w:r>

</xml_diff>

<commit_message>
Restaurar diagrama del pipeline en informe + ajustes feedback profe
</commit_message>
<xml_diff>
--- a/reporte/informe_tecnico_proyecto_DIIAA.docx
+++ b/reporte/informe_tecnico_proyecto_DIIAA.docx
@@ -3367,72 +3367,53 @@
     </w:p>
     <w:p>
       <w:pPr>
-        <w:rPr/>
-      </w:pPr>
-      <w:r>
-        <w:rPr>
-          <w:rFonts w:ascii="Consolas" w:cs="Consolas" w:eastAsia="Consolas" w:hAnsi="Consolas"/>
+        <w:jc w:val="center"/>
+      </w:pPr>
+      <w:r>
+        <w:drawing>
+          <wp:inline>
+            <wp:extent cx="5400000" cy="4172727"/>
+            <wp:docPr id="1" name="Picture 1"/>
+            <wp:cNvGraphicFramePr>
+              <a:graphicFrameLocks noChangeAspect="1"/>
+            </wp:cNvGraphicFramePr>
+            <a:graphic>
+              <a:graphicData uri="http://schemas.openxmlformats.org/drawingml/2006/picture">
+                <pic:pic>
+                  <pic:nvPicPr>
+                    <pic:cNvPr id="0" name="pipeline_diagram.png"/>
+                    <pic:cNvPicPr/>
+                  </pic:nvPicPr>
+                  <pic:blipFill>
+                    <a:blip r:embed="rId6"/>
+                    <a:stretch>
+                      <a:fillRect/>
+                    </a:stretch>
+                  </pic:blipFill>
+                  <pic:spPr>
+                    <a:xfrm>
+                      <a:off x="0" y="0"/>
+                      <a:ext cx="5400000" cy="4172727"/>
+                    </a:xfrm>
+                    <a:prstGeom prst="rect"/>
+                  </pic:spPr>
+                </pic:pic>
+              </a:graphicData>
+            </a:graphic>
+          </wp:inline>
+        </w:drawing>
+      </w:r>
+    </w:p>
+    <w:p>
+      <w:pPr>
+        <w:jc w:val="center"/>
+      </w:pPr>
+      <w:r>
+        <w:rPr>
+          <w:i/>
           <w:sz w:val="18"/>
-          <w:szCs w:val="18"/>
-          <w:rtl w:val="0"/>
-        </w:rPr>
-        <w:t xml:space="preserve">┌─────────────────┐    ┌──────────────────┐    ┌────────────────────┐</w:t>
-        <w:br w:type="textWrapping"/>
-        <w:t xml:space="preserve">│   1. Ingesta    │ →  │ 2. Procesamiento │ →  │  3. Vectorización  │</w:t>
-        <w:br w:type="textWrapping"/>
-        <w:t xml:space="preserve">│ mail crudo      │    │ (PII redaction*) │    │ multilingual-e5-large│</w:t>
-        <w:br w:type="textWrapping"/>
-        <w:t xml:space="preserve">└─────────────────┘    └──────────────────┘    └─────────┬──────────┘</w:t>
-        <w:br w:type="textWrapping"/>
-        <w:t xml:space="preserve">                                                          │</w:t>
-        <w:br w:type="textWrapping"/>
-        <w:t xml:space="preserve">                                                          ▼</w:t>
-        <w:br w:type="textWrapping"/>
-        <w:t xml:space="preserve">             ┌────────────────────────────────────────────────────┐</w:t>
-        <w:br w:type="textWrapping"/>
-        <w:t xml:space="preserve">             │             4. Recuperación híbrida                │</w:t>
-        <w:br w:type="textWrapping"/>
-        <w:t xml:space="preserve">             │   ┌──────────┐     ┌──────────────┐                │</w:t>
-        <w:br w:type="textWrapping"/>
-        <w:t xml:space="preserve">             │   │   BM25   │  +  │ Chroma + e5  │  →  RRF (k=60) │</w:t>
-        <w:br w:type="textWrapping"/>
-        <w:t xml:space="preserve">             │   └──────────┘     └──────────────┘                │</w:t>
-        <w:br w:type="textWrapping"/>
-        <w:t xml:space="preserve">             └─────────────────────────┬──────────────────────────┘</w:t>
-        <w:br w:type="textWrapping"/>
-        <w:t xml:space="preserve">                                       │</w:t>
-        <w:br w:type="textWrapping"/>
-        <w:t xml:space="preserve">                                       ▼</w:t>
-        <w:br w:type="textWrapping"/>
-        <w:t xml:space="preserve">             ┌────────────────────────────────────────────────────┐</w:t>
-        <w:br w:type="textWrapping"/>
-        <w:t xml:space="preserve">             │             5. Generación con LLM                   │</w:t>
-        <w:br w:type="textWrapping"/>
-        <w:t xml:space="preserve">             │   Gemini 2.5 Flash Lite + system prompt RAG +       │</w:t>
-        <w:br w:type="textWrapping"/>
-        <w:t xml:space="preserve">             │   Pydantic schema (response_schema=MailAnalysis)    │</w:t>
-        <w:br w:type="textWrapping"/>
-        <w:t xml:space="preserve">             └─────────────────────────┬──────────────────────────┘</w:t>
-        <w:br w:type="textWrapping"/>
-        <w:t xml:space="preserve">                                       │</w:t>
-        <w:br w:type="textWrapping"/>
-        <w:t xml:space="preserve">                                       ▼</w:t>
-        <w:br w:type="textWrapping"/>
-        <w:t xml:space="preserve">                       MailAnalysis (JSON validado)</w:t>
-        <w:br w:type="textWrapping"/>
-        <w:t xml:space="preserve">                       {intent, confidence, summary, urgency,</w:t>
-        <w:br w:type="textWrapping"/>
-        <w:t xml:space="preserve">                        language, entities, suggested_response, sources}</w:t>
-        <w:br w:type="textWrapping"/>
-        <w:br w:type="textWrapping"/>
-        <w:t xml:space="preserve">* PII redaction: en el alcance del PoC se diseñó pero no se implementó.</w:t>
-        <w:br w:type="textWrapping"/>
-        <w:t xml:space="preserve">  Ver Conclusiones (Sección 6) para trabajo futuro.</w:t>
-      </w:r>
-      <w:r>
-        <w:rPr>
-          <w:rtl w:val="0"/>
-        </w:rPr>
+        </w:rPr>
+        <w:t>Figura 1. Pipeline del sistema. La estrella (*) indica que la etapa de PII redaction fue diseñada pero no implementada en el PoC.</w:t>
       </w:r>
     </w:p>
     <w:p>
@@ -8719,61 +8700,6 @@
           <w:rtl w:val="0"/>
         </w:rPr>
         <w:t xml:space="preserve">Anexo B — Estructura del repositorio</w:t>
-      </w:r>
-      <w:r>
-        <w:rPr>
-          <w:rtl w:val="0"/>
-        </w:rPr>
-      </w:r>
-    </w:p>
-    <w:p>
-      <w:pPr>
-        <w:rPr/>
-      </w:pPr>
-      <w:r>
-        <w:rPr>
-          <w:rFonts w:ascii="Consolas" w:cs="Consolas" w:eastAsia="Consolas" w:hAnsi="Consolas"/>
-          <w:sz w:val="18"/>
-          <w:szCs w:val="18"/>
-          <w:rtl w:val="0"/>
-        </w:rPr>
-        <w:t xml:space="preserve">proyecto-final-rag/</w:t>
-        <w:br w:type="textWrapping"/>
-        <w:t xml:space="preserve">├── README.md</w:t>
-        <w:br w:type="textWrapping"/>
-        <w:t xml:space="preserve">├── requirements.txt</w:t>
-        <w:br w:type="textWrapping"/>
-        <w:t xml:space="preserve">├── .env.example</w:t>
-        <w:br w:type="textWrapping"/>
-        <w:t xml:space="preserve">├── notebooks/                          # 6 notebooks reproducibles</w:t>
-        <w:br w:type="textWrapping"/>
-        <w:t xml:space="preserve">├── src/                                # paquete Python</w:t>
-        <w:br w:type="textWrapping"/>
-        <w:t xml:space="preserve">│   ├── schemas.py                      # Pydantic: MailAnalysis</w:t>
-        <w:br w:type="textWrapping"/>
-        <w:t xml:space="preserve">│   ├── prompts.py                      # System prompts baseline + RAG</w:t>
-        <w:br w:type="textWrapping"/>
-        <w:t xml:space="preserve">│   ├── llm.py                          # Cliente Gemini con structured output</w:t>
-        <w:br w:type="textWrapping"/>
-        <w:t xml:space="preserve">│   ├── kb_generate.py                  # Generación sintética del KB</w:t>
-        <w:br w:type="textWrapping"/>
-        <w:t xml:space="preserve">│   ├── kb_ingest.py                    # Chunking + indexado dual</w:t>
-        <w:br w:type="textWrapping"/>
-        <w:t xml:space="preserve">│   ├── retriever.py                    # Búsqueda híbrida con RRF</w:t>
-        <w:br w:type="textWrapping"/>
-        <w:t xml:space="preserve">│   ├── pipeline.py                     # Orquestador end-to-end</w:t>
-        <w:br w:type="textWrapping"/>
-        <w:t xml:space="preserve">│   └── evaluation.py                   # Métricas + LLM-as-judge</w:t>
-        <w:br w:type="textWrapping"/>
-        <w:t xml:space="preserve">├── data/</w:t>
-        <w:br w:type="textWrapping"/>
-        <w:t xml:space="preserve">│   ├── kb/                             # 35 FAQs (.md con frontmatter)</w:t>
-        <w:br w:type="textWrapping"/>
-        <w:t xml:space="preserve">│   └── eval/ground_truth.json          # 15 mails de evaluación</w:t>
-        <w:br w:type="textWrapping"/>
-        <w:t xml:space="preserve">└── reporte/</w:t>
-        <w:br w:type="textWrapping"/>
-        <w:t xml:space="preserve">    └── informe_tecnico.docx            # este documento</w:t>
       </w:r>
       <w:r>
         <w:rPr>

</xml_diff>